<commit_message>
Add three 2026 teaching engagements to website and CVs
</commit_message>
<xml_diff>
--- a/Kyuhee_Jung_CV_2026_en.docx
+++ b/Kyuhee_Jung_CV_2026_en.docx
@@ -2630,6 +2630,60 @@
           <w:szCs w:val="20"/>
         </w:rPr>
       </w:pPr>
+    </w:p>
+    <w:p>
+      <w:pPr>
+        <w:keepLines/>
+        <w:rPr>
+          <w:rFonts w:ascii="한컴 고딕" w:eastAsia="한컴 고딕" w:hAnsi="한컴 고딕" w:cs="Times New Roman"/>
+          <w:sz w:val="20"/>
+          <w:szCs w:val="20"/>
+        </w:rPr>
+      </w:pPr>
+      <w:r>
+        <w:rPr>
+          <w:rFonts w:ascii="한컴 고딕" w:eastAsia="한컴 고딕" w:hAnsi="한컴 고딕" w:cs="Times New Roman" w:hint="eastAsia"/>
+          <w:sz w:val="20"/>
+          <w:szCs w:val="20"/>
+        </w:rPr>
+        <w:t>• September 8, 2026: Human Error and Traffic Psychology, lecture.</w:t>
+      </w:r>
+    </w:p>
+    <w:p>
+      <w:pPr>
+        <w:keepLines/>
+        <w:rPr>
+          <w:rFonts w:ascii="한컴 고딕" w:eastAsia="한컴 고딕" w:hAnsi="한컴 고딕" w:cs="Times New Roman"/>
+          <w:sz w:val="20"/>
+          <w:szCs w:val="20"/>
+        </w:rPr>
+      </w:pPr>
+      <w:r>
+        <w:rPr>
+          <w:rFonts w:ascii="한컴 고딕" w:eastAsia="한컴 고딕" w:hAnsi="한컴 고딕" w:cs="Times New Roman" w:hint="eastAsia"/>
+          <w:sz w:val="20"/>
+          <w:szCs w:val="20"/>
+        </w:rPr>
+        <w:t>• May 21, 2026: Understanding Child Deaths, lecture, Gyeongbuk Human Resources Development Institute.</w:t>
+      </w:r>
+    </w:p>
+    <w:p>
+      <w:pPr>
+        <w:keepLines/>
+        <w:rPr>
+          <w:rFonts w:ascii="한컴 고딕" w:eastAsia="한컴 고딕" w:hAnsi="한컴 고딕" w:cs="Times New Roman"/>
+          <w:sz w:val="20"/>
+          <w:szCs w:val="20"/>
+        </w:rPr>
+      </w:pPr>
+      <w:r>
+        <w:rPr>
+          <w:rFonts w:ascii="한컴 고딕" w:eastAsia="한컴 고딕" w:hAnsi="한컴 고딕" w:cs="Times New Roman" w:hint="eastAsia"/>
+          <w:sz w:val="20"/>
+          <w:szCs w:val="20"/>
+        </w:rPr>
+        <w:t>• May 19, 2026: Human Error and Traffic Psychology, lecture.</w:t>
+      </w:r>
     </w:p>
     <w:p>
       <w:pPr>

</xml_diff>

<commit_message>
Correct PhD graduation date and simplify specialization
</commit_message>
<xml_diff>
--- a/Kyuhee_Jung_CV_2026_en.docx
+++ b/Kyuhee_Jung_CV_2026_en.docx
@@ -203,7 +203,7 @@
           <w:sz w:val="20"/>
           <w:szCs w:val="20"/>
         </w:rPr>
-        <w:t>Specialization: Social Psychology, Forensic Psychology, Child Abuse; AI and machine learning-based data analysis; statistical modeling and Bayesian network analysis</w:t>
+        <w:t>Specialization: Social Psychology, Forensic Psychology, Child Abuse; AI and machine learning-based data analysis; statistical modeling</w:t>
       </w:r>
     </w:p>
     <w:p>
@@ -258,7 +258,7 @@
           <w:sz w:val="20"/>
           <w:szCs w:val="20"/>
         </w:rPr>
-        <w:t xml:space="preserve"> 2013.4.1 ~ 2016.4.20: Ph.D. in Social Psychology, The University of Tokyo, Japan</w:t>
+        <w:t xml:space="preserve"> 2013.4.1 ~ 2023.4: Ph.D. in Social Psychology, The University of Tokyo, Japan</w:t>
       </w:r>
     </w:p>
     <w:p>

</xml_diff>

<commit_message>
Add Child Maltreatment to ad hoc reviewer service
</commit_message>
<xml_diff>
--- a/Kyuhee_Jung_CV_2026_en.docx
+++ b/Kyuhee_Jung_CV_2026_en.docx
@@ -2998,6 +2998,26 @@
           <w:szCs w:val="20"/>
         </w:rPr>
       </w:pPr>
+    </w:p>
+    <w:p>
+      <w:pPr>
+        <w:keepLines/>
+        <w:rPr>
+          <w:rFonts w:ascii="한컴 고딕" w:eastAsia="한컴 고딕" w:hAnsi="한컴 고딕" w:cs="바탕"/>
+          <w:bCs/>
+          <w:sz w:val="20"/>
+          <w:szCs w:val="20"/>
+        </w:rPr>
+      </w:pPr>
+      <w:r>
+        <w:rPr>
+          <w:rFonts w:ascii="한컴 고딕" w:eastAsia="한컴 고딕" w:hAnsi="한컴 고딕" w:cs="바탕" w:hint="eastAsia"/>
+          <w:bCs/>
+          <w:sz w:val="20"/>
+          <w:szCs w:val="20"/>
+        </w:rPr>
+        <w:t>• Child Maltreatment</w:t>
+      </w:r>
     </w:p>
     <w:p>
       <w:pPr>

</xml_diff>

<commit_message>
Add data analysis and trading qualifications
</commit_message>
<xml_diff>
--- a/Kyuhee_Jung_CV_2026_en.docx
+++ b/Kyuhee_Jung_CV_2026_en.docx
@@ -95,6 +95,41 @@
       </w:pPr>
       <w:r>
         <w:t>2002.3.1 ~ 2007.2.15: B.A. in Psychology (Advanced Course), Chung-Ang University, Korea</w:t>
+      </w:r>
+    </w:p>
+    <w:p>
+      <w:pPr>
+        <w:pStyle w:val="Heading1"/>
+      </w:pPr>
+      <w:r>
+        <w:t>Qualifications</w:t>
+      </w:r>
+    </w:p>
+    <w:p>
+      <w:pPr>
+        <w:pStyle w:val="ListBullet"/>
+        <w:keepLines/>
+      </w:pPr>
+      <w:r>
+        <w:t>빅데이터분석기사 — Big Data Analysis Qualification</w:t>
+      </w:r>
+    </w:p>
+    <w:p>
+      <w:pPr>
+        <w:pStyle w:val="ListBullet"/>
+        <w:keepLines/>
+      </w:pPr>
+      <w:r>
+        <w:t>ADsP — Data Analysis Qualification</w:t>
+      </w:r>
+    </w:p>
+    <w:p>
+      <w:pPr>
+        <w:pStyle w:val="ListBullet"/>
+        <w:keepLines/>
+      </w:pPr>
+      <w:r>
+        <w:t>데이터거래사 — Data Trading Qualification</w:t>
       </w:r>
     </w:p>
     <w:p>

</xml_diff>

<commit_message>
Move qualifications below teaching experience
</commit_message>
<xml_diff>
--- a/Kyuhee_Jung_CV_2026_en.docx
+++ b/Kyuhee_Jung_CV_2026_en.docx
@@ -95,41 +95,6 @@
       </w:pPr>
       <w:r>
         <w:t>2002.3.1 ~ 2007.2.15: B.A. in Psychology (Advanced Course), Chung-Ang University, Korea</w:t>
-      </w:r>
-    </w:p>
-    <w:p>
-      <w:pPr>
-        <w:pStyle w:val="Heading1"/>
-      </w:pPr>
-      <w:r>
-        <w:t>Qualifications</w:t>
-      </w:r>
-    </w:p>
-    <w:p>
-      <w:pPr>
-        <w:pStyle w:val="ListBullet"/>
-        <w:keepLines/>
-      </w:pPr>
-      <w:r>
-        <w:t>빅데이터분석기사 — Big Data Analysis Qualification</w:t>
-      </w:r>
-    </w:p>
-    <w:p>
-      <w:pPr>
-        <w:pStyle w:val="ListBullet"/>
-        <w:keepLines/>
-      </w:pPr>
-      <w:r>
-        <w:t>ADsP — Data Analysis Qualification</w:t>
-      </w:r>
-    </w:p>
-    <w:p>
-      <w:pPr>
-        <w:pStyle w:val="ListBullet"/>
-        <w:keepLines/>
-      </w:pPr>
-      <w:r>
-        <w:t>데이터거래사 — Data Trading Qualification</w:t>
       </w:r>
     </w:p>
     <w:p>
@@ -1611,6 +1576,41 @@
         <w:pStyle w:val="Heading1"/>
       </w:pPr>
       <w:r>
+        <w:t>Qualifications</w:t>
+      </w:r>
+    </w:p>
+    <w:p>
+      <w:pPr>
+        <w:pStyle w:val="ListBullet"/>
+        <w:keepLines/>
+      </w:pPr>
+      <w:r>
+        <w:t>빅데이터분석기사 — Big Data Analysis Qualification</w:t>
+      </w:r>
+    </w:p>
+    <w:p>
+      <w:pPr>
+        <w:pStyle w:val="ListBullet"/>
+        <w:keepLines/>
+      </w:pPr>
+      <w:r>
+        <w:t>ADsP — Data Analysis Qualification</w:t>
+      </w:r>
+    </w:p>
+    <w:p>
+      <w:pPr>
+        <w:pStyle w:val="ListBullet"/>
+        <w:keepLines/>
+      </w:pPr>
+      <w:r>
+        <w:t>데이터거래사 — Data Trading Qualification</w:t>
+      </w:r>
+    </w:p>
+    <w:p>
+      <w:pPr>
+        <w:pStyle w:val="Heading1"/>
+      </w:pPr>
+      <w:r>
         <w:t>Professional Service</w:t>
       </w:r>
     </w:p>

</xml_diff>

<commit_message>
Correct publication metadata in website and CVs
</commit_message>
<xml_diff>
--- a/Kyuhee_Jung_CV_2026_en.docx
+++ b/Kyuhee_Jung_CV_2026_en.docx
@@ -251,7 +251,7 @@
         <w:rPr>
           <w:i w:val="0"/>
         </w:rPr>
-        <w:t>, Kim, H., Choi, I., &amp; Yang, K.-M. (in press). An exploratory study of suspicious perinatal deaths: Expanding the concept of neonaticide through forensic autopsy data (2018</w:t>
+        <w:t>, Kim, H., Choi, I., &amp; Yang, K.-M. (2025). An exploratory study of suspicious perinatal deaths: Expanding the concept of neonaticide through forensic autopsy data (2018</w:t>
       </w:r>
       <w:r>
         <w:rPr>
@@ -269,31 +269,27 @@
         <w:rPr>
           <w:i/>
         </w:rPr>
-        <w:t xml:space="preserve">Korean Criminological </w:t>
+        <w:t>Korean Criminological Review, 36(3), 289–317. doi:10.36889/KCR.2025.9.30.3.289 (Korean)</w:t>
       </w:r>
       <w:r>
         <w:rPr>
           <w:i/>
         </w:rPr>
-        <w:t>Review</w:t>
       </w:r>
       <w:r>
         <w:rPr>
           <w:i w:val="0"/>
         </w:rPr>
-        <w:t>(</w:t>
       </w:r>
       <w:r>
         <w:rPr>
           <w:i w:val="0"/>
         </w:rPr>
-        <w:t>Korean</w:t>
       </w:r>
       <w:r>
         <w:rPr>
           <w:i w:val="0"/>
         </w:rPr>
-        <w:t>)</w:t>
       </w:r>
     </w:p>
     <w:p>
@@ -319,13 +315,13 @@
         <w:rPr>
           <w:i/>
         </w:rPr>
-        <w:t>Child Abuse &amp; Neglect. 169,</w:t>
+        <w:t>Child Abuse &amp; Neglect. 169, 107654</w:t>
       </w:r>
       <w:r>
         <w:rPr>
           <w:i w:val="0"/>
         </w:rPr>
-        <w:t xml:space="preserve"> 1-7654. </w:t>
+        <w:t xml:space="preserve">. </w:t>
       </w:r>
       <w:r>
         <w:rPr>
@@ -550,19 +546,19 @@
         <w:rPr>
           <w:i w:val="0"/>
         </w:rPr>
-        <w:t xml:space="preserve"> (2016). Happiness as an additional antecedent of schadenfreude. </w:t>
+        <w:t xml:space="preserve"> (2017). Happiness as an additional antecedent of schadenfreude. </w:t>
       </w:r>
       <w:r>
         <w:rPr>
           <w:i/>
         </w:rPr>
-        <w:t>Journal of Positive Psychology</w:t>
+        <w:t>Journal of Positive Psychology, 12(2), 186–196.</w:t>
       </w:r>
       <w:r>
         <w:rPr>
           <w:i w:val="0"/>
         </w:rPr>
-        <w:t>. doi:10.1080/17439760.2016.1173224</w:t>
+        <w:t xml:space="preserve"> doi:10.1080/17439760.2016.1173224</w:t>
       </w:r>
     </w:p>
     <w:p>

</xml_diff>

<commit_message>
Refresh Korean and English CV media, teaching and final book citation
</commit_message>
<xml_diff>
--- a/Kyuhee_Jung_CV_2026_en.docx
+++ b/Kyuhee_Jung_CV_2026_en.docx
@@ -131,41 +131,7 @@
         <w:ind w:left="259" w:hanging="259"/>
       </w:pPr>
       <w:r>
-        <w:rPr>
-          <w:b/>
-          <w:i w:val="0"/>
-        </w:rPr>
-        <w:t>Jung, K. H.</w:t>
-      </w:r>
-      <w:r>
-        <w:rPr>
-          <w:i w:val="0"/>
-        </w:rPr>
-        <w:t xml:space="preserve">, Yang, K. M., &amp; Kim, H. (2023). Manifestation of violence. In C. Martin, V. R. </w:t>
-      </w:r>
-      <w:r>
-        <w:rPr>
-          <w:i w:val="0"/>
-        </w:rPr>
-        <w:t>Preedy</w:t>
-      </w:r>
-      <w:r>
-        <w:rPr>
-          <w:i w:val="0"/>
-        </w:rPr>
-        <w:t xml:space="preserve">, &amp; V. B. Patel (Eds.), </w:t>
-      </w:r>
-      <w:r>
-        <w:rPr>
-          <w:i/>
-        </w:rPr>
-        <w:t>Handbook of Anger, Aggression, and Violence</w:t>
-      </w:r>
-      <w:r>
-        <w:rPr>
-          <w:i w:val="0"/>
-        </w:rPr>
-        <w:t>. Springer. doi:10.1007/978-3-030-98711-4_135-1</w:t>
+        <w:t>Jung, K., Yang, K.-m., &amp; Kim, H. (2023). Manifestation of violence: Child homicide in South Korea. In C. R. Martin, V. R. Preedy, &amp; V. B. Patel (Eds.), Handbook of Anger, Aggression, and Violence (pp. 2547–2567). Springer. https://doi.org/10.1007/978-3-031-31547-3_135</w:t>
       </w:r>
     </w:p>
     <w:p>
@@ -1519,6 +1485,96 @@
         <w:keepLines/>
       </w:pPr>
       <w:r>
+        <w:t>October 13, 2025: Understanding Child Death, lecture, Gangwon Regional Child Protection Agencies Joint Education.</w:t>
+      </w:r>
+    </w:p>
+    <w:p>
+      <w:pPr>
+        <w:pStyle w:val="ListBullet"/>
+        <w:keepLines/>
+      </w:pPr>
+      <w:r>
+        <w:t>September 23, 2025: Human Error and Traffic Psychology, lecture, National Forensic Service forensic science training.</w:t>
+      </w:r>
+    </w:p>
+    <w:p>
+      <w:pPr>
+        <w:pStyle w:val="ListBullet"/>
+        <w:keepLines/>
+      </w:pPr>
+      <w:r>
+        <w:t>September 22, 2025: Understanding Child Abuse Death, lecture, Incheon Child Protection Agency.</w:t>
+      </w:r>
+    </w:p>
+    <w:p>
+      <w:pPr>
+        <w:pStyle w:val="ListBullet"/>
+        <w:keepLines/>
+      </w:pPr>
+      <w:r>
+        <w:t>September 12, 2025: Human Error and Traffic Psychology, lecture, KAMA (Korea Automobile &amp; Mobility Association) CS Workshop.</w:t>
+      </w:r>
+    </w:p>
+    <w:p>
+      <w:pPr>
+        <w:pStyle w:val="ListBullet"/>
+        <w:keepLines/>
+      </w:pPr>
+      <w:r>
+        <w:t>August 22, 2025: Understanding Child Abuse Death, lecture, staff capacity-building training, Daejeon-Seobu Child Protection Agency.</w:t>
+      </w:r>
+    </w:p>
+    <w:p>
+      <w:pPr>
+        <w:pStyle w:val="ListBullet"/>
+        <w:keepLines/>
+      </w:pPr>
+      <w:r>
+        <w:t>June 2025 onward: Instructor, joint child abuse training, National Center for the Rights of the Child.</w:t>
+      </w:r>
+    </w:p>
+    <w:p>
+      <w:pPr>
+        <w:pStyle w:val="ListBullet"/>
+        <w:keepLines/>
+      </w:pPr>
+      <w:r>
+        <w:t>June 20, 2025: Understanding Child Abuse Death, lecture, staff capacity-building training, Ulsan Child Protection Agency.</w:t>
+      </w:r>
+    </w:p>
+    <w:p>
+      <w:pPr>
+        <w:pStyle w:val="ListBullet"/>
+        <w:keepLines/>
+      </w:pPr>
+      <w:r>
+        <w:t>May 19, 2025: Child Abuse from the Perspective of Parenting Ability and Willingness, lecture, staff capacity-building training, Chungbuk Child Protection Agency.</w:t>
+      </w:r>
+    </w:p>
+    <w:p>
+      <w:pPr>
+        <w:pStyle w:val="ListBullet"/>
+        <w:keepLines/>
+      </w:pPr>
+      <w:r>
+        <w:t>March 28, 2025 onward: Psychology instructor, psychophysiological examiner training, Defense Counterintelligence Command.</w:t>
+      </w:r>
+    </w:p>
+    <w:p>
+      <w:pPr>
+        <w:pStyle w:val="ListBullet"/>
+        <w:keepLines/>
+      </w:pPr>
+      <w:r>
+        <w:t>2021, 2022, October 17, 2023, April 9, 2024, and April 16, 2025: Understanding Child Death course, National Forensic Service.</w:t>
+      </w:r>
+    </w:p>
+    <w:p>
+      <w:pPr>
+        <w:pStyle w:val="ListBullet"/>
+        <w:keepLines/>
+      </w:pPr>
+      <w:r>
         <w:t>2015: Research Assistant</w:t>
       </w:r>
     </w:p>
@@ -1706,6 +1762,22 @@
       </w:pPr>
       <w:r>
         <w:t>Media Coverage</w:t>
+      </w:r>
+    </w:p>
+    <w:p>
+      <w:pPr>
+        <w:keepLines/>
+      </w:pPr>
+      <w:r>
+        <w:t>October 22, 2026: SisaIN Issue 998 cover story, 'The Infant Deaths We Do Not Know About' (published online). https://www.sisain.co.kr/news/articleView.html?idxno=58697</w:t>
+      </w:r>
+    </w:p>
+    <w:p>
+      <w:pPr>
+        <w:keepLines/>
+      </w:pPr>
+      <w:r>
+        <w:t>October 16, 2026: Appeared on KBS1's Tracking 60 Minutes, Episode 1476: 'A Home Turned into Hell - Why Couldn't We Prevent Children's Deaths?' https://youtu.be/nH0QiTUhc2o</w:t>
       </w:r>
     </w:p>
     <w:p>

</xml_diff>